<commit_message>
To Fetch and Present Total Active Assets in Dashboard(Assigned,Returned,Transferred & Available)
</commit_message>
<xml_diff>
--- a/db_backup/status.docx
+++ b/db_backup/status.docx
@@ -2133,6 +2133,513 @@
         <w:t xml:space="preserve"> Go backend</w:t>
       </w:r>
     </w:p>
+    <w:p/>
+    <w:p/>
+    <w:p/>
+    <w:p>
+      <w:pPr>
+        <w:rPr>
+          <w:b/>
+          <w:bCs/>
+        </w:rPr>
+      </w:pPr>
+      <w:r>
+        <w:rPr>
+          <w:b/>
+          <w:bCs/>
+        </w:rPr>
+        <w:t xml:space="preserve">2. Available page </w:t>
+      </w:r>
+      <w:proofErr w:type="spellStart"/>
+      <w:r>
+        <w:rPr>
+          <w:rFonts w:ascii="Nirmala UI" w:hAnsi="Nirmala UI" w:cs="Nirmala UI"/>
+          <w:b/>
+          <w:bCs/>
+        </w:rPr>
+        <w:t>আলাদা</w:t>
+      </w:r>
+      <w:proofErr w:type="spellEnd"/>
+      <w:r>
+        <w:rPr>
+          <w:b/>
+          <w:bCs/>
+        </w:rPr>
+        <w:t xml:space="preserve"> handle </w:t>
+      </w:r>
+      <w:proofErr w:type="spellStart"/>
+      <w:r>
+        <w:rPr>
+          <w:rFonts w:ascii="Nirmala UI" w:hAnsi="Nirmala UI" w:cs="Nirmala UI"/>
+          <w:b/>
+          <w:bCs/>
+        </w:rPr>
+        <w:t>করতে</w:t>
+      </w:r>
+      <w:proofErr w:type="spellEnd"/>
+      <w:r>
+        <w:rPr>
+          <w:b/>
+          <w:bCs/>
+        </w:rPr>
+        <w:t xml:space="preserve"> </w:t>
+      </w:r>
+      <w:proofErr w:type="spellStart"/>
+      <w:r>
+        <w:rPr>
+          <w:rFonts w:ascii="Nirmala UI" w:hAnsi="Nirmala UI" w:cs="Nirmala UI"/>
+          <w:b/>
+          <w:bCs/>
+        </w:rPr>
+        <w:t>হবে</w:t>
+      </w:r>
+      <w:proofErr w:type="spellEnd"/>
+    </w:p>
+    <w:p>
+      <w:r>
+        <w:t xml:space="preserve">Available data </w:t>
+      </w:r>
+      <w:proofErr w:type="spellStart"/>
+      <w:r>
+        <w:t>it_equipment</w:t>
+      </w:r>
+      <w:proofErr w:type="spellEnd"/>
+      <w:r>
+        <w:t xml:space="preserve"> </w:t>
+      </w:r>
+      <w:proofErr w:type="spellStart"/>
+      <w:r>
+        <w:rPr>
+          <w:rFonts w:ascii="Nirmala UI" w:hAnsi="Nirmala UI" w:cs="Nirmala UI"/>
+        </w:rPr>
+        <w:t>থেকে</w:t>
+      </w:r>
+      <w:proofErr w:type="spellEnd"/>
+      <w:r>
+        <w:t xml:space="preserve"> </w:t>
+      </w:r>
+      <w:proofErr w:type="spellStart"/>
+      <w:r>
+        <w:rPr>
+          <w:rFonts w:ascii="Nirmala UI" w:hAnsi="Nirmala UI" w:cs="Nirmala UI"/>
+        </w:rPr>
+        <w:t>আসবে</w:t>
+      </w:r>
+      <w:proofErr w:type="spellEnd"/>
+      <w:r>
+        <w:t xml:space="preserve"> </w:t>
+      </w:r>
+      <w:proofErr w:type="spellStart"/>
+      <w:r>
+        <w:rPr>
+          <w:rFonts w:ascii="Nirmala UI" w:hAnsi="Nirmala UI" w:cs="Nirmala UI"/>
+        </w:rPr>
+        <w:t>না</w:t>
+      </w:r>
+      <w:proofErr w:type="spellEnd"/>
+      <w:r>
+        <w:t xml:space="preserve">, </w:t>
+      </w:r>
+      <w:proofErr w:type="spellStart"/>
+      <w:r>
+        <w:rPr>
+          <w:rFonts w:ascii="Nirmala UI" w:hAnsi="Nirmala UI" w:cs="Nirmala UI"/>
+        </w:rPr>
+        <w:t>এটা</w:t>
+      </w:r>
+      <w:proofErr w:type="spellEnd"/>
+      <w:r>
+        <w:t xml:space="preserve"> </w:t>
+      </w:r>
+      <w:proofErr w:type="spellStart"/>
+      <w:r>
+        <w:t>stack_inventory</w:t>
+      </w:r>
+      <w:proofErr w:type="spellEnd"/>
+      <w:r>
+        <w:t xml:space="preserve"> </w:t>
+      </w:r>
+      <w:proofErr w:type="spellStart"/>
+      <w:r>
+        <w:rPr>
+          <w:rFonts w:ascii="Nirmala UI" w:hAnsi="Nirmala UI" w:cs="Nirmala UI"/>
+        </w:rPr>
+        <w:t>থেকে</w:t>
+      </w:r>
+      <w:proofErr w:type="spellEnd"/>
+      <w:r>
+        <w:t xml:space="preserve"> </w:t>
+      </w:r>
+      <w:proofErr w:type="spellStart"/>
+      <w:r>
+        <w:rPr>
+          <w:rFonts w:ascii="Nirmala UI" w:hAnsi="Nirmala UI" w:cs="Nirmala UI"/>
+        </w:rPr>
+        <w:t>আসবে</w:t>
+      </w:r>
+      <w:proofErr w:type="spellEnd"/>
+      <w:r>
+        <w:rPr>
+          <w:rFonts w:ascii="Nirmala UI" w:hAnsi="Nirmala UI" w:cs="Nirmala UI"/>
+        </w:rPr>
+        <w:t>।</w:t>
+      </w:r>
+      <w:r>
+        <w:t xml:space="preserve"> </w:t>
+      </w:r>
+      <w:proofErr w:type="spellStart"/>
+      <w:r>
+        <w:rPr>
+          <w:rFonts w:ascii="Nirmala UI" w:hAnsi="Nirmala UI" w:cs="Nirmala UI"/>
+        </w:rPr>
+        <w:t>তাই</w:t>
+      </w:r>
+      <w:proofErr w:type="spellEnd"/>
+      <w:r>
+        <w:t xml:space="preserve"> dashboard card </w:t>
+      </w:r>
+      <w:proofErr w:type="spellStart"/>
+      <w:r>
+        <w:rPr>
+          <w:rFonts w:ascii="Nirmala UI" w:hAnsi="Nirmala UI" w:cs="Nirmala UI"/>
+        </w:rPr>
+        <w:t>থেকে</w:t>
+      </w:r>
+      <w:proofErr w:type="spellEnd"/>
+      <w:r>
+        <w:t xml:space="preserve"> Available click </w:t>
+      </w:r>
+      <w:proofErr w:type="spellStart"/>
+      <w:r>
+        <w:rPr>
+          <w:rFonts w:ascii="Nirmala UI" w:hAnsi="Nirmala UI" w:cs="Nirmala UI"/>
+        </w:rPr>
+        <w:t>করলে</w:t>
+      </w:r>
+      <w:proofErr w:type="spellEnd"/>
+      <w:r>
+        <w:t xml:space="preserve"> </w:t>
+      </w:r>
+      <w:proofErr w:type="spellStart"/>
+      <w:r>
+        <w:rPr>
+          <w:rFonts w:ascii="Nirmala UI" w:hAnsi="Nirmala UI" w:cs="Nirmala UI"/>
+        </w:rPr>
+        <w:t>এই</w:t>
+      </w:r>
+      <w:proofErr w:type="spellEnd"/>
+      <w:r>
+        <w:t xml:space="preserve"> route better:</w:t>
+      </w:r>
+    </w:p>
+    <w:p>
+      <w:r>
+        <w:t>/dashboard/reports/</w:t>
+      </w:r>
+      <w:proofErr w:type="spellStart"/>
+      <w:r>
+        <w:t>assets?status</w:t>
+      </w:r>
+      <w:proofErr w:type="spellEnd"/>
+      <w:r>
+        <w:t>=Available</w:t>
+      </w:r>
+    </w:p>
+    <w:p>
+      <w:r>
+        <w:t xml:space="preserve">Backend function </w:t>
+      </w:r>
+      <w:r>
+        <w:rPr>
+          <w:rFonts w:ascii="Nirmala UI" w:hAnsi="Nirmala UI" w:cs="Nirmala UI"/>
+        </w:rPr>
+        <w:t>এ</w:t>
+      </w:r>
+      <w:r>
+        <w:t xml:space="preserve"> status == "Available" </w:t>
+      </w:r>
+      <w:proofErr w:type="spellStart"/>
+      <w:r>
+        <w:rPr>
+          <w:rFonts w:ascii="Nirmala UI" w:hAnsi="Nirmala UI" w:cs="Nirmala UI"/>
+        </w:rPr>
+        <w:t>হলে</w:t>
+      </w:r>
+      <w:proofErr w:type="spellEnd"/>
+      <w:r>
+        <w:t xml:space="preserve"> </w:t>
+      </w:r>
+      <w:proofErr w:type="spellStart"/>
+      <w:r>
+        <w:t>stack_inventory</w:t>
+      </w:r>
+      <w:proofErr w:type="spellEnd"/>
+      <w:r>
+        <w:t xml:space="preserve"> query </w:t>
+      </w:r>
+      <w:proofErr w:type="spellStart"/>
+      <w:r>
+        <w:rPr>
+          <w:rFonts w:ascii="Nirmala UI" w:hAnsi="Nirmala UI" w:cs="Nirmala UI"/>
+        </w:rPr>
+        <w:t>করতে</w:t>
+      </w:r>
+      <w:proofErr w:type="spellEnd"/>
+      <w:r>
+        <w:t xml:space="preserve"> </w:t>
+      </w:r>
+      <w:proofErr w:type="spellStart"/>
+      <w:r>
+        <w:rPr>
+          <w:rFonts w:ascii="Nirmala UI" w:hAnsi="Nirmala UI" w:cs="Nirmala UI"/>
+        </w:rPr>
+        <w:t>হবে</w:t>
+      </w:r>
+      <w:proofErr w:type="spellEnd"/>
+      <w:r>
+        <w:rPr>
+          <w:rFonts w:ascii="Nirmala UI" w:hAnsi="Nirmala UI" w:cs="Nirmala UI"/>
+        </w:rPr>
+        <w:t>।</w:t>
+      </w:r>
+      <w:r>
+        <w:t xml:space="preserve"> </w:t>
+      </w:r>
+      <w:proofErr w:type="spellStart"/>
+      <w:r>
+        <w:rPr>
+          <w:rFonts w:ascii="Nirmala UI" w:hAnsi="Nirmala UI" w:cs="Nirmala UI"/>
+        </w:rPr>
+        <w:t>আগে</w:t>
+      </w:r>
+      <w:proofErr w:type="spellEnd"/>
+      <w:r>
+        <w:t xml:space="preserve"> Assigned/Returned/Transferred fix </w:t>
+      </w:r>
+      <w:proofErr w:type="spellStart"/>
+      <w:r>
+        <w:rPr>
+          <w:rFonts w:ascii="Nirmala UI" w:hAnsi="Nirmala UI" w:cs="Nirmala UI"/>
+        </w:rPr>
+        <w:t>করো</w:t>
+      </w:r>
+      <w:proofErr w:type="spellEnd"/>
+      <w:r>
+        <w:t xml:space="preserve">, </w:t>
+      </w:r>
+      <w:proofErr w:type="spellStart"/>
+      <w:r>
+        <w:rPr>
+          <w:rFonts w:ascii="Nirmala UI" w:hAnsi="Nirmala UI" w:cs="Nirmala UI"/>
+        </w:rPr>
+        <w:t>তারপর</w:t>
+      </w:r>
+      <w:proofErr w:type="spellEnd"/>
+      <w:r>
+        <w:t xml:space="preserve"> Available add </w:t>
+      </w:r>
+      <w:proofErr w:type="spellStart"/>
+      <w:r>
+        <w:rPr>
+          <w:rFonts w:ascii="Nirmala UI" w:hAnsi="Nirmala UI" w:cs="Nirmala UI"/>
+        </w:rPr>
+        <w:t>করবো</w:t>
+      </w:r>
+      <w:proofErr w:type="spellEnd"/>
+      <w:r>
+        <w:rPr>
+          <w:rFonts w:ascii="Nirmala UI" w:hAnsi="Nirmala UI" w:cs="Nirmala UI"/>
+        </w:rPr>
+        <w:t>।</w:t>
+      </w:r>
+    </w:p>
+    <w:p>
+      <w:pPr>
+        <w:rPr>
+          <w:b/>
+          <w:bCs/>
+        </w:rPr>
+      </w:pPr>
+      <w:r>
+        <w:rPr>
+          <w:b/>
+          <w:bCs/>
+        </w:rPr>
+        <w:t>3. Backend restart</w:t>
+      </w:r>
+    </w:p>
+    <w:p>
+      <w:r>
+        <w:t>netstat -</w:t>
+      </w:r>
+      <w:proofErr w:type="spellStart"/>
+      <w:r>
+        <w:t>ano</w:t>
+      </w:r>
+      <w:proofErr w:type="spellEnd"/>
+      <w:r>
+        <w:t xml:space="preserve"> | </w:t>
+      </w:r>
+      <w:proofErr w:type="spellStart"/>
+      <w:r>
+        <w:t>findstr</w:t>
+      </w:r>
+      <w:proofErr w:type="spellEnd"/>
+      <w:r>
+        <w:t xml:space="preserve"> :8080</w:t>
+      </w:r>
+      <w:r>
+        <w:br/>
+      </w:r>
+      <w:proofErr w:type="spellStart"/>
+      <w:r>
+        <w:t>taskkill</w:t>
+      </w:r>
+      <w:proofErr w:type="spellEnd"/>
+      <w:r>
+        <w:t xml:space="preserve"> /PID YOUR_PID /F</w:t>
+      </w:r>
+      <w:r>
+        <w:br/>
+      </w:r>
+      <w:r>
+        <w:br/>
+        <w:t>cd D:\ITM-Data\itm\backend</w:t>
+      </w:r>
+      <w:r>
+        <w:br/>
+        <w:t xml:space="preserve">go </w:t>
+      </w:r>
+      <w:proofErr w:type="gramStart"/>
+      <w:r>
+        <w:t>run .</w:t>
+      </w:r>
+      <w:proofErr w:type="gramEnd"/>
+      <w:r>
+        <w:t>/</w:t>
+      </w:r>
+      <w:proofErr w:type="spellStart"/>
+      <w:r>
+        <w:t>cmd</w:t>
+      </w:r>
+      <w:proofErr w:type="spellEnd"/>
+      <w:r>
+        <w:t>/server</w:t>
+      </w:r>
+    </w:p>
+    <w:p>
+      <w:pPr>
+        <w:rPr>
+          <w:b/>
+          <w:bCs/>
+        </w:rPr>
+      </w:pPr>
+      <w:r>
+        <w:rPr>
+          <w:b/>
+          <w:bCs/>
+        </w:rPr>
+        <w:t>4. Test direct API</w:t>
+      </w:r>
+    </w:p>
+    <w:p>
+      <w:r>
+        <w:t>Invoke-</w:t>
+      </w:r>
+      <w:proofErr w:type="spellStart"/>
+      <w:r>
+        <w:t>RestMethod</w:t>
+      </w:r>
+      <w:proofErr w:type="spellEnd"/>
+      <w:r>
+        <w:t xml:space="preserve"> `</w:t>
+      </w:r>
+      <w:r>
+        <w:br/>
+        <w:t xml:space="preserve">  -Uri "http://localhost:8080/</w:t>
+      </w:r>
+      <w:proofErr w:type="spellStart"/>
+      <w:r>
+        <w:t>api</w:t>
+      </w:r>
+      <w:proofErr w:type="spellEnd"/>
+      <w:r>
+        <w:t>/v1/reports/</w:t>
+      </w:r>
+      <w:proofErr w:type="spellStart"/>
+      <w:r>
+        <w:t>assets?status</w:t>
+      </w:r>
+      <w:proofErr w:type="spellEnd"/>
+      <w:r>
+        <w:t>=Transferred" `</w:t>
+      </w:r>
+      <w:r>
+        <w:br/>
+        <w:t xml:space="preserve">  -Method GET `</w:t>
+      </w:r>
+      <w:r>
+        <w:br/>
+        <w:t xml:space="preserve">  -Headers </w:t>
+      </w:r>
+      <w:proofErr w:type="gramStart"/>
+      <w:r>
+        <w:t>@{ Authorization</w:t>
+      </w:r>
+      <w:proofErr w:type="gramEnd"/>
+      <w:r>
+        <w:t xml:space="preserve"> = "Bearer $token</w:t>
+      </w:r>
+      <w:proofErr w:type="gramStart"/>
+      <w:r>
+        <w:t>" }</w:t>
+      </w:r>
+      <w:proofErr w:type="gramEnd"/>
+      <w:r>
+        <w:t xml:space="preserve"> |</w:t>
+      </w:r>
+      <w:r>
+        <w:br/>
+      </w:r>
+      <w:proofErr w:type="spellStart"/>
+      <w:r>
+        <w:t>ConvertTo</w:t>
+      </w:r>
+      <w:proofErr w:type="spellEnd"/>
+      <w:r>
+        <w:t>-Json -Depth 5</w:t>
+      </w:r>
+    </w:p>
+    <w:p>
+      <w:r>
+        <w:t>Expected now:</w:t>
+      </w:r>
+    </w:p>
+    <w:p>
+      <w:r>
+        <w:t>Only status 3 / Transferred devices</w:t>
+      </w:r>
+    </w:p>
+    <w:p>
+      <w:r>
+        <w:t>Then test:</w:t>
+      </w:r>
+    </w:p>
+    <w:p>
+      <w:r>
+        <w:lastRenderedPageBreak/>
+        <w:t>http://localhost:5173/dashboard/reports/assets?status=Transferred</w:t>
+      </w:r>
+      <w:r>
+        <w:br/>
+        <w:t>http://localhost:5173/dashboard/reports/assets?status=Assigned</w:t>
+      </w:r>
+      <w:r>
+        <w:br/>
+        <w:t>http://localhost:5173/dashboard/reports/assets?status=Returned</w:t>
+      </w:r>
+    </w:p>
+    <w:p/>
     <w:sectPr>
       <w:pgSz w:w="12240" w:h="15840"/>
       <w:pgMar w:top="1440" w:right="1440" w:bottom="1440" w:left="1440" w:header="720" w:footer="720" w:gutter="0"/>

</xml_diff>